<commit_message>
Lab 2: add Jira screenshots (backlog, story points, sprint board, burndowns) and screenshot PDF; update reflection from real sprint results
Co-Authored-By: Claude Opus 5.5 <noreply@anthropic.com>
</commit_message>
<xml_diff>
--- a/Lab 2 Deliverables/Lab2_Reflection.docx
+++ b/Lab 2 Deliverables/Lab2_Reflection.docx
@@ -314,7 +314,7 @@
     <w:p>
       <w:r>
         <w:rPr/>
-        <w:t>Both sprints were completed with all committed stories Done (18 points in Sprint 1, 17 points in Sprint 2). Because the sprint was simulated, stories were moved in priority order rather than over real working days, so the order of completion matched the plan.</w:t>
+        <w:t>Both sprints were run in Jira and completed with every committed story Done (18 of 18 points in PGS Sprint 1, 17 of 17 points in PGS Sprint 2), and the 2 backlog stories (1.3, 2.3) stayed out of scope as planned. Stories were moved To Do -&gt; In Progress -&gt; Done in priority order, so the order of completion matched the plan. The difference from a real sprint is time: the simulation finished each sprint within minutes on day 1 instead of across the 1-week time box.</w:t>
       </w:r>
     </w:p>
     <w:p>
@@ -333,7 +333,7 @@
     <w:p>
       <w:r>
         <w:rPr/>
-        <w:t>The remaining-work line dropped in steps as each story moved to Done. The 5-point stories caused the biggest single drops, so splitting them (for example, separating slot holds from the booking form) would give a smoother, more predictable burndown. The two sprints suggest a velocity of about 18 points per week, so the remaining 6 points fit easily into Sprint 3.</w:t>
+        <w:t>In both charts the red Remaining Values line falls from the committed total (18 and 17 points) to 0 at the very start of the sprint, far below the grey guideline that assumes steady progress over the week; the hatched area is the weekend (non-working days). The chart therefore shows no scope creep - the total never rose - and that the committed work was completed. Because all work was finished in one sitting, the chart cannot measure real daily capacity; in a real sprint, finishing this far ahead of the guideline would be a sign of under-commitment. The 5-point stories produced the largest single drops, so splitting them would give a smoother, more informative burndown. Planned velocity is about 18 points per sprint, so the remaining 6 points fit easily into Sprint 3.</w:t>
       </w:r>
     </w:p>
     <w:sectPr>

</xml_diff>